<commit_message>
docs: update team deck and embed real prompt log evidence
</commit_message>
<xml_diff>
--- a/competition/ai-tai-nang-viet-2026/artifacts/01_FocusGuard_HoSo_BangA_8trang.docx
+++ b/competition/ai-tai-nang-viet-2026/artifacts/01_FocusGuard_HoSo_BangA_8trang.docx
@@ -58,13 +58,18 @@
               <w:spacing w:after="0"/>
               <w:jc w:val="left"/>
             </w:pPr>
-            <w:r/>
             <w:r>
               <w:rPr>
-                <w:rFonts w:ascii="Aptos" w:hAnsi="Aptos"/>
+                <w:rFonts w:ascii="Arial" w:hAnsi="Arial"/>
+                <w:sz w:val="21"/>
+              </w:rPr>
+            </w:r>
+            <w:r>
+              <w:rPr>
+                <w:rFonts w:ascii="Arial" w:hAnsi="Arial"/>
                 <w:b/>
                 <w:color w:val="183153"/>
-                <w:sz w:val="18"/>
+                <w:sz w:val="21"/>
               </w:rPr>
               <w:t>Tên đội</w:t>
             </w:r>
@@ -84,17 +89,20 @@
           <w:p>
             <w:pPr>
               <w:spacing w:after="0"/>
-              <w:jc w:val="left"/>
             </w:pPr>
-            <w:r/>
             <w:r>
               <w:rPr>
-                <w:rFonts w:ascii="Aptos" w:hAnsi="Aptos"/>
-                <w:b w:val="0"/>
-                <w:color w:val="183153"/>
-                <w:sz w:val="18"/>
+                <w:rFonts w:ascii="Arial" w:hAnsi="Arial"/>
+                <w:sz w:val="21"/>
               </w:rPr>
-              <w:t>[ĐIỀN TÊN ĐỘI ĐÃ ĐĂNG KÝ]</w:t>
+            </w:r>
+            <w:r>
+              <w:rPr>
+                <w:rFonts w:ascii="Arial" w:hAnsi="Arial"/>
+                <w:b/>
+                <w:sz w:val="21"/>
+              </w:rPr>
+              <w:t>iKH Future Makers (Mã đội AI26A0049)</w:t>
             </w:r>
           </w:p>
         </w:tc>
@@ -117,13 +125,18 @@
               <w:spacing w:after="0"/>
               <w:jc w:val="left"/>
             </w:pPr>
-            <w:r/>
             <w:r>
               <w:rPr>
-                <w:rFonts w:ascii="Aptos" w:hAnsi="Aptos"/>
+                <w:rFonts w:ascii="Arial" w:hAnsi="Arial"/>
+                <w:sz w:val="21"/>
+              </w:rPr>
+            </w:r>
+            <w:r>
+              <w:rPr>
+                <w:rFonts w:ascii="Arial" w:hAnsi="Arial"/>
                 <w:b/>
                 <w:color w:val="183153"/>
-                <w:sz w:val="18"/>
+                <w:sz w:val="21"/>
               </w:rPr>
               <w:t>Thành viên</w:t>
             </w:r>
@@ -143,17 +156,20 @@
           <w:p>
             <w:pPr>
               <w:spacing w:after="0"/>
-              <w:jc w:val="left"/>
             </w:pPr>
-            <w:r/>
             <w:r>
               <w:rPr>
-                <w:rFonts w:ascii="Aptos" w:hAnsi="Aptos"/>
+                <w:rFonts w:ascii="Arial" w:hAnsi="Arial"/>
+                <w:sz w:val="21"/>
+              </w:rPr>
+            </w:r>
+            <w:r>
+              <w:rPr>
+                <w:rFonts w:ascii="Arial" w:hAnsi="Arial"/>
                 <w:b w:val="0"/>
-                <w:color w:val="183153"/>
-                <w:sz w:val="18"/>
+                <w:sz w:val="21"/>
               </w:rPr>
-              <w:t>[ĐIỀN HỌ TÊN 1–3 THÍ SINH]</w:t>
+              <w:t>Nguyễn Hoàng Bảo Long</w:t>
             </w:r>
           </w:p>
         </w:tc>
@@ -176,13 +192,18 @@
               <w:spacing w:after="0"/>
               <w:jc w:val="left"/>
             </w:pPr>
-            <w:r/>
             <w:r>
               <w:rPr>
-                <w:rFonts w:ascii="Aptos" w:hAnsi="Aptos"/>
+                <w:rFonts w:ascii="Arial" w:hAnsi="Arial"/>
+                <w:sz w:val="21"/>
+              </w:rPr>
+            </w:r>
+            <w:r>
+              <w:rPr>
+                <w:rFonts w:ascii="Arial" w:hAnsi="Arial"/>
                 <w:b/>
                 <w:color w:val="183153"/>
-                <w:sz w:val="18"/>
+                <w:sz w:val="21"/>
               </w:rPr>
               <w:t>Trường/Lớp</w:t>
             </w:r>
@@ -202,17 +223,20 @@
           <w:p>
             <w:pPr>
               <w:spacing w:after="0"/>
-              <w:jc w:val="left"/>
             </w:pPr>
-            <w:r/>
             <w:r>
               <w:rPr>
-                <w:rFonts w:ascii="Aptos" w:hAnsi="Aptos"/>
+                <w:rFonts w:ascii="Arial" w:hAnsi="Arial"/>
+                <w:sz w:val="21"/>
+              </w:rPr>
+            </w:r>
+            <w:r>
+              <w:rPr>
+                <w:rFonts w:ascii="Arial" w:hAnsi="Arial"/>
                 <w:b w:val="0"/>
-                <w:color w:val="183153"/>
-                <w:sz w:val="18"/>
+                <w:sz w:val="21"/>
               </w:rPr>
-              <w:t>[ĐIỀN ĐÚNG THÔNG TIN ĐÃ ĐĂNG KÝ]</w:t>
+              <w:t>Lớp 8/1 - Trường THCS Tây Nha Trang, Khánh Hòa</w:t>
             </w:r>
           </w:p>
         </w:tc>
@@ -235,13 +259,18 @@
               <w:spacing w:after="0"/>
               <w:jc w:val="left"/>
             </w:pPr>
-            <w:r/>
             <w:r>
               <w:rPr>
-                <w:rFonts w:ascii="Aptos" w:hAnsi="Aptos"/>
+                <w:rFonts w:ascii="Arial" w:hAnsi="Arial"/>
+                <w:sz w:val="21"/>
+              </w:rPr>
+            </w:r>
+            <w:r>
+              <w:rPr>
+                <w:rFonts w:ascii="Arial" w:hAnsi="Arial"/>
                 <w:b/>
                 <w:color w:val="183153"/>
-                <w:sz w:val="18"/>
+                <w:sz w:val="21"/>
               </w:rPr>
               <w:t>Giáo viên hướng dẫn</w:t>
             </w:r>
@@ -261,17 +290,20 @@
           <w:p>
             <w:pPr>
               <w:spacing w:after="0"/>
-              <w:jc w:val="left"/>
             </w:pPr>
-            <w:r/>
             <w:r>
               <w:rPr>
-                <w:rFonts w:ascii="Aptos" w:hAnsi="Aptos"/>
+                <w:rFonts w:ascii="Arial" w:hAnsi="Arial"/>
+                <w:sz w:val="21"/>
+              </w:rPr>
+            </w:r>
+            <w:r>
+              <w:rPr>
+                <w:rFonts w:ascii="Arial" w:hAnsi="Arial"/>
                 <w:b w:val="0"/>
-                <w:color w:val="183153"/>
-                <w:sz w:val="18"/>
+                <w:sz w:val="21"/>
               </w:rPr>
-              <w:t>[ĐIỀN NẾU CÓ]</w:t>
+              <w:t>Không có</w:t>
             </w:r>
           </w:p>
         </w:tc>
@@ -294,13 +326,18 @@
               <w:spacing w:after="0"/>
               <w:jc w:val="left"/>
             </w:pPr>
-            <w:r/>
             <w:r>
               <w:rPr>
-                <w:rFonts w:ascii="Aptos" w:hAnsi="Aptos"/>
+                <w:rFonts w:ascii="Arial" w:hAnsi="Arial"/>
+                <w:sz w:val="21"/>
+              </w:rPr>
+            </w:r>
+            <w:r>
+              <w:rPr>
+                <w:rFonts w:ascii="Arial" w:hAnsi="Arial"/>
                 <w:b/>
                 <w:color w:val="183153"/>
-                <w:sz w:val="18"/>
+                <w:sz w:val="21"/>
               </w:rPr>
               <w:t>Bảng thi</w:t>
             </w:r>
@@ -322,13 +359,18 @@
               <w:spacing w:after="0"/>
               <w:jc w:val="left"/>
             </w:pPr>
-            <w:r/>
             <w:r>
               <w:rPr>
-                <w:rFonts w:ascii="Aptos" w:hAnsi="Aptos"/>
+                <w:rFonts w:ascii="Arial" w:hAnsi="Arial"/>
+                <w:sz w:val="21"/>
+              </w:rPr>
+            </w:r>
+            <w:r>
+              <w:rPr>
+                <w:rFonts w:ascii="Arial" w:hAnsi="Arial"/>
                 <w:b w:val="0"/>
                 <w:color w:val="183153"/>
-                <w:sz w:val="18"/>
+                <w:sz w:val="21"/>
               </w:rPr>
               <w:t>Bảng A – Học sinh THCS</w:t>
             </w:r>
@@ -353,13 +395,18 @@
               <w:spacing w:after="0"/>
               <w:jc w:val="left"/>
             </w:pPr>
-            <w:r/>
             <w:r>
               <w:rPr>
-                <w:rFonts w:ascii="Aptos" w:hAnsi="Aptos"/>
+                <w:rFonts w:ascii="Arial" w:hAnsi="Arial"/>
+                <w:sz w:val="21"/>
+              </w:rPr>
+            </w:r>
+            <w:r>
+              <w:rPr>
+                <w:rFonts w:ascii="Arial" w:hAnsi="Arial"/>
                 <w:b/>
                 <w:color w:val="183153"/>
-                <w:sz w:val="18"/>
+                <w:sz w:val="21"/>
               </w:rPr>
               <w:t>Sản phẩm</w:t>
             </w:r>
@@ -381,13 +428,18 @@
               <w:spacing w:after="0"/>
               <w:jc w:val="left"/>
             </w:pPr>
-            <w:r/>
             <w:r>
               <w:rPr>
-                <w:rFonts w:ascii="Aptos" w:hAnsi="Aptos"/>
+                <w:rFonts w:ascii="Arial" w:hAnsi="Arial"/>
+                <w:sz w:val="21"/>
+              </w:rPr>
+            </w:r>
+            <w:r>
+              <w:rPr>
+                <w:rFonts w:ascii="Arial" w:hAnsi="Arial"/>
                 <w:b w:val="0"/>
                 <w:color w:val="183153"/>
-                <w:sz w:val="18"/>
+                <w:sz w:val="21"/>
               </w:rPr>
               <w:t>FocusGuard – Hệ thống hỗ trợ giáo viên nhận biết tín hiệu mất tập trung bằng camera</w:t>
             </w:r>
@@ -3526,7 +3578,7 @@
                 <w:color w:val="183153"/>
                 <w:sz w:val="17"/>
               </w:rPr>
-              <w:t>142 test pass, 0 fail, 9 skip theo điều kiện phần cứng/emulator</w:t>
+              <w:t>184 test pass, 0 fail, 9 skip theo điều kiện phần cứng/emulator</w:t>
             </w:r>
           </w:p>
         </w:tc>
@@ -4727,10 +4779,10 @@
       </w:pPr>
       <w:r>
         <w:rPr>
-          <w:rFonts w:ascii="Aptos" w:hAnsi="Aptos"/>
-          <w:sz w:val="20"/>
+          <w:rFonts w:ascii="Arial" w:hAnsi="Arial"/>
+          <w:sz w:val="21"/>
         </w:rPr>
-        <w:t>Hoàn thiện UI/UX để các trạng thái camera, dữ liệu thiếu và cảnh báo được hiểu ngay.</w:t>
+        <w:t>Xác nhận lại camera thật trên giao diện mới và tiếp tục đánh giá UX bằng các kịch bản trình diễn thực tế.</w:t>
       </w:r>
     </w:p>
     <w:p>
@@ -4856,7 +4908,12 @@
     </w:p>
     <w:p>
       <w:r>
-        <w:t>Ghi chú trước khi nộp: thay các trường [ĐIỀN ...] ở trang 1 bằng đúng thông tin đội đã đăng ký; nếu Ban Tổ chức cung cấp file mẫu bắt buộc, chuyển nguyên nội dung 8 trang này vào đúng mẫu mà không tự thay đổi số liệu kỹ thuật.</w:t>
+        <w:rPr>
+          <w:rFonts w:ascii="Arial" w:hAnsi="Arial"/>
+          <w:i/>
+          <w:sz w:val="19"/>
+        </w:rPr>
+        <w:t>Thông tin đội: iKH Future Makers - Mã đội AI26A0049 - 1 thành viên: Nguyễn Hoàng Bảo Long, lớp 8/1, Trường THCS Tây Nha Trang. Giáo viên/chuyên gia hướng dẫn: Không có.</w:t>
       </w:r>
     </w:p>
     <w:sectPr>

</xml_diff>